<commit_message>
README for anyone who clones; REBUILD current; fix the app install step
- Root README rewritten for a cloner: what the repo holds, install on any
  Frappe v16 bench, install with Docker, the three settings a backup does not
  carry, and the known limits of the helper scripts (paths and names of the
  build machine, Windows-only pieces, demo data restores from a backup).
- `bench get-app ./mscast_erp` cannot work: the app is in a subfolder and
  bench opens the path as a git repository (bench 5.31 app.py). README and the
  Cutover Runbook now install it the way the image does (copy, pip install -e,
  apps.txt, assets link), per Containerfile.mscast.
- REBUILD.md: three ways to get a system (clean / demo from backup / DEV),
  settings to set after a restore; seed scripts described as a record, not a
  rebuild path. reset-poc.sh header says the same.

Co-Authored-By: Claude Opus 5 <noreply@anthropic.com>
Claude-Session: https://claude.ai/code/session_01G3y6MpPfn3Nhms7B2xeYDR
</commit_message>
<xml_diff>
--- a/ERP Plan/MSCAST ERP - Production Cutover Runbook.docx
+++ b/ERP Plan/MSCAST ERP - Production Cutover Runbook.docx
@@ -691,22 +691,232 @@
         <w:rPr>
           <w:rStyle w:val="NormalTok"/>
         </w:rPr>
-        <w:t xml:space="preserve"> clone git@github.com:cb1-tech/mscast.git</w:t>
+        <w:t xml:space="preserve"> clone git@github.com:cb1-tech/mscast.git /opt/mscast</w:t>
       </w:r>
       <w:r>
         <w:br/>
       </w:r>
       <w:r>
         <w:rPr>
+          <w:rStyle w:val="FunctionTok"/>
+        </w:rPr>
+        <w:t xml:space="preserve">git</w:t>
+      </w:r>
+      <w:r>
+        <w:rPr>
+          <w:rStyle w:val="NormalTok"/>
+        </w:rPr>
+        <w:t xml:space="preserve"> </w:t>
+      </w:r>
+      <w:r>
+        <w:rPr>
+          <w:rStyle w:val="AttributeTok"/>
+        </w:rPr>
+        <w:t xml:space="preserve">-C</w:t>
+      </w:r>
+      <w:r>
+        <w:rPr>
+          <w:rStyle w:val="NormalTok"/>
+        </w:rPr>
+        <w:t xml:space="preserve"> /opt/mscast checkout v1.0.0          </w:t>
+      </w:r>
+      <w:r>
+        <w:rPr>
+          <w:rStyle w:val="CommentTok"/>
+        </w:rPr>
+        <w:t xml:space="preserve"># the release being deployed. Write it down.</w:t>
+      </w:r>
+      <w:r>
+        <w:br/>
+      </w:r>
+      <w:r>
+        <w:rPr>
+          <w:rStyle w:val="FunctionTok"/>
+        </w:rPr>
+        <w:t xml:space="preserve">git</w:t>
+      </w:r>
+      <w:r>
+        <w:rPr>
+          <w:rStyle w:val="NormalTok"/>
+        </w:rPr>
+        <w:t xml:space="preserve"> </w:t>
+      </w:r>
+      <w:r>
+        <w:rPr>
+          <w:rStyle w:val="AttributeTok"/>
+        </w:rPr>
+        <w:t xml:space="preserve">-C</w:t>
+      </w:r>
+      <w:r>
+        <w:rPr>
+          <w:rStyle w:val="NormalTok"/>
+        </w:rPr>
+        <w:t xml:space="preserve"> /opt/mscast rev-parse </w:t>
+      </w:r>
+      <w:r>
+        <w:rPr>
+          <w:rStyle w:val="AttributeTok"/>
+        </w:rPr>
+        <w:t xml:space="preserve">--short</w:t>
+      </w:r>
+      <w:r>
+        <w:rPr>
+          <w:rStyle w:val="NormalTok"/>
+        </w:rPr>
+        <w:t xml:space="preserve"> HEAD   </w:t>
+      </w:r>
+      <w:r>
+        <w:rPr>
+          <w:rStyle w:val="CommentTok"/>
+        </w:rPr>
+        <w:t xml:space="preserve"># record this in the deployment log</w:t>
+      </w:r>
+      <w:r>
+        <w:br/>
+      </w:r>
+      <w:r>
+        <w:br/>
+      </w:r>
+      <w:r>
+        <w:rPr>
+          <w:rStyle w:val="CommentTok"/>
+        </w:rPr>
+        <w:t xml:space="preserve"># from the frappe-bench folder. The app is in a subfolder of the repo, so</w:t>
+      </w:r>
+      <w:r>
+        <w:br/>
+      </w:r>
+      <w:r>
+        <w:rPr>
+          <w:rStyle w:val="CommentTok"/>
+        </w:rPr>
+        <w:t xml:space="preserve"># `bench get-app` cannot fetch it (it expects the app at the repo root);</w:t>
+      </w:r>
+      <w:r>
+        <w:br/>
+      </w:r>
+      <w:r>
+        <w:rPr>
+          <w:rStyle w:val="CommentTok"/>
+        </w:rPr>
+        <w:t xml:space="preserve"># install it the way the image does (erpnext-poc/Containerfile.mscast):</w:t>
+      </w:r>
+      <w:r>
+        <w:br/>
+      </w:r>
+      <w:r>
+        <w:rPr>
+          <w:rStyle w:val="FunctionTok"/>
+        </w:rPr>
+        <w:t xml:space="preserve">cp</w:t>
+      </w:r>
+      <w:r>
+        <w:rPr>
+          <w:rStyle w:val="NormalTok"/>
+        </w:rPr>
+        <w:t xml:space="preserve"> </w:t>
+      </w:r>
+      <w:r>
+        <w:rPr>
+          <w:rStyle w:val="AttributeTok"/>
+        </w:rPr>
+        <w:t xml:space="preserve">-r</w:t>
+      </w:r>
+      <w:r>
+        <w:rPr>
+          <w:rStyle w:val="NormalTok"/>
+        </w:rPr>
+        <w:t xml:space="preserve"> /opt/mscast/mscast_erp apps/mscast_erp</w:t>
+      </w:r>
+      <w:r>
+        <w:br/>
+      </w:r>
+      <w:r>
+        <w:rPr>
+          <w:rStyle w:val="ExtensionTok"/>
+        </w:rPr>
+        <w:t xml:space="preserve">./env/bin/pip</w:t>
+      </w:r>
+      <w:r>
+        <w:rPr>
+          <w:rStyle w:val="NormalTok"/>
+        </w:rPr>
+        <w:t xml:space="preserve"> install </w:t>
+      </w:r>
+      <w:r>
+        <w:rPr>
+          <w:rStyle w:val="AttributeTok"/>
+        </w:rPr>
+        <w:t xml:space="preserve">--editable</w:t>
+      </w:r>
+      <w:r>
+        <w:rPr>
+          <w:rStyle w:val="NormalTok"/>
+        </w:rPr>
+        <w:t xml:space="preserve"> apps/mscast_erp</w:t>
+      </w:r>
+      <w:r>
+        <w:br/>
+      </w:r>
+      <w:r>
+        <w:rPr>
+          <w:rStyle w:val="FunctionTok"/>
+        </w:rPr>
+        <w:t xml:space="preserve">grep</w:t>
+      </w:r>
+      <w:r>
+        <w:rPr>
+          <w:rStyle w:val="NormalTok"/>
+        </w:rPr>
+        <w:t xml:space="preserve"> </w:t>
+      </w:r>
+      <w:r>
+        <w:rPr>
+          <w:rStyle w:val="AttributeTok"/>
+        </w:rPr>
+        <w:t xml:space="preserve">-qx</w:t>
+      </w:r>
+      <w:r>
+        <w:rPr>
+          <w:rStyle w:val="NormalTok"/>
+        </w:rPr>
+        <w:t xml:space="preserve"> mscast_erp sites/apps.txt </w:t>
+      </w:r>
+      <w:r>
+        <w:rPr>
+          <w:rStyle w:val="KeywordTok"/>
+        </w:rPr>
+        <w:t xml:space="preserve">||</w:t>
+      </w:r>
+      <w:r>
+        <w:rPr>
+          <w:rStyle w:val="NormalTok"/>
+        </w:rPr>
+        <w:t xml:space="preserve"> </w:t>
+      </w:r>
+      <w:r>
+        <w:rPr>
           <w:rStyle w:val="BuiltInTok"/>
         </w:rPr>
-        <w:t xml:space="preserve">cd</w:t>
+        <w:t xml:space="preserve">echo</w:t>
       </w:r>
       <w:r>
         <w:rPr>
           <w:rStyle w:val="NormalTok"/>
         </w:rPr>
-        <w:t xml:space="preserve"> mscast</w:t>
+        <w:t xml:space="preserve"> mscast_erp </w:t>
+      </w:r>
+      <w:r>
+        <w:rPr>
+          <w:rStyle w:val="OperatorTok"/>
+        </w:rPr>
+        <w:t xml:space="preserve">&gt;&gt;</w:t>
+      </w:r>
+      <w:r>
+        <w:rPr>
+          <w:rStyle w:val="NormalTok"/>
+        </w:rPr>
+        <w:t xml:space="preserve"> sites/apps.txt</w:t>
       </w:r>
       <w:r>
         <w:br/>
@@ -715,70 +925,49 @@
         <w:rPr>
           <w:rStyle w:val="FunctionTok"/>
         </w:rPr>
-        <w:t xml:space="preserve">git</w:t>
+        <w:t xml:space="preserve">ln</w:t>
       </w:r>
       <w:r>
         <w:rPr>
           <w:rStyle w:val="NormalTok"/>
         </w:rPr>
-        <w:t xml:space="preserve"> checkout v1.0.0            </w:t>
-      </w:r>
-      <w:r>
-        <w:rPr>
-          <w:rStyle w:val="CommentTok"/>
-        </w:rPr>
-        <w:t xml:space="preserve"># the release being deployed. Write it down.</w:t>
-      </w:r>
-      <w:r>
-        <w:br/>
-      </w:r>
-      <w:r>
-        <w:rPr>
-          <w:rStyle w:val="FunctionTok"/>
-        </w:rPr>
-        <w:t xml:space="preserve">git</w:t>
+        <w:t xml:space="preserve"> </w:t>
+      </w:r>
+      <w:r>
+        <w:rPr>
+          <w:rStyle w:val="AttributeTok"/>
+        </w:rPr>
+        <w:t xml:space="preserve">-sfn</w:t>
       </w:r>
       <w:r>
         <w:rPr>
           <w:rStyle w:val="NormalTok"/>
         </w:rPr>
-        <w:t xml:space="preserve"> rev-parse </w:t>
-      </w:r>
-      <w:r>
-        <w:rPr>
-          <w:rStyle w:val="AttributeTok"/>
-        </w:rPr>
-        <w:t xml:space="preserve">--short</w:t>
+        <w:t xml:space="preserve"> </w:t>
+      </w:r>
+      <w:r>
+        <w:rPr>
+          <w:rStyle w:val="StringTok"/>
+        </w:rPr>
+        <w:t xml:space="preserve">"</w:t>
+      </w:r>
+      <w:r>
+        <w:rPr>
+          <w:rStyle w:val="VariableTok"/>
+        </w:rPr>
+        <w:t xml:space="preserve">$PWD</w:t>
+      </w:r>
+      <w:r>
+        <w:rPr>
+          <w:rStyle w:val="StringTok"/>
+        </w:rPr>
+        <w:t xml:space="preserve">/apps/mscast_erp/mscast_erp/public"</w:t>
       </w:r>
       <w:r>
         <w:rPr>
           <w:rStyle w:val="NormalTok"/>
         </w:rPr>
-        <w:t xml:space="preserve"> HEAD     </w:t>
-      </w:r>
-      <w:r>
-        <w:rPr>
-          <w:rStyle w:val="CommentTok"/>
-        </w:rPr>
-        <w:t xml:space="preserve"># record this in the deployment log</w:t>
-      </w:r>
-      <w:r>
-        <w:br/>
-      </w:r>
-      <w:r>
-        <w:br/>
-      </w:r>
-      <w:r>
-        <w:rPr>
-          <w:rStyle w:val="ExtensionTok"/>
-        </w:rPr>
-        <w:t xml:space="preserve">bench</w:t>
-      </w:r>
-      <w:r>
-        <w:rPr>
-          <w:rStyle w:val="NormalTok"/>
-        </w:rPr>
-        <w:t xml:space="preserve"> get-app ./mscast_erp</w:t>
+        <w:t xml:space="preserve"> assets/mscast_erp</w:t>
       </w:r>
       <w:r>
         <w:br/>
@@ -1685,22 +1874,16 @@
         <w:t xml:space="preserve"> </w:t>
       </w:r>
       <w:r>
-        <w:t xml:space="preserve">(fresh python each time) and the build checks still pass. Install with</w:t>
-      </w:r>
-      <w:r>
-        <w:t xml:space="preserve"> </w:t>
+        <w:t xml:space="preserve">(fresh python each time) and the build checks still pass. Install as above, or deploy an image that carries the app (</w:t>
       </w:r>
       <w:r>
         <w:rPr>
           <w:rStyle w:val="VerbatimChar"/>
         </w:rPr>
-        <w:t xml:space="preserve">bench get-app</w:t>
-      </w:r>
-      <w:r>
-        <w:t xml:space="preserve"> </w:t>
-      </w:r>
-      <w:r>
-        <w:t xml:space="preserve">as above, or deploy an image that carries the app, then:</w:t>
+        <w:t xml:space="preserve">scripts/build-mscast-image.sh</w:t>
+      </w:r>
+      <w:r>
+        <w:t xml:space="preserve">), then:</w:t>
       </w:r>
     </w:p>
     <w:p>

</xml_diff>